<commit_message>
feat: establish design system v3
</commit_message>
<xml_diff>
--- a/brand/exports/agustos/office/agustos-letterhead.docx
+++ b/brand/exports/agustos/office/agustos-letterhead.docx
@@ -3,25 +3,23 @@
 <w:document xmlns:wpc="http://schemas.microsoft.com/office/word/2010/wordprocessingCanvas" xmlns:mo="http://schemas.microsoft.com/office/mac/office/2008/main" xmlns:mc="http://schemas.openxmlformats.org/markup-compatibility/2006" xmlns:mv="urn:schemas-microsoft-com:mac:vml" xmlns:o="urn:schemas-microsoft-com:office:office" xmlns:r="http://schemas.openxmlformats.org/officeDocument/2006/relationships" xmlns:m="http://schemas.openxmlformats.org/officeDocument/2006/math" xmlns:v="urn:schemas-microsoft-com:vml" xmlns:wp14="http://schemas.microsoft.com/office/word/2010/wordprocessingDrawing" xmlns:wp="http://schemas.openxmlformats.org/drawingml/2006/wordprocessingDrawing" xmlns:w10="urn:schemas-microsoft-com:office:word" xmlns:w="http://schemas.openxmlformats.org/wordprocessingml/2006/main" xmlns:w14="http://schemas.microsoft.com/office/word/2010/wordml" xmlns:wpg="http://schemas.microsoft.com/office/word/2010/wordprocessingGroup" xmlns:wpi="http://schemas.microsoft.com/office/word/2010/wordprocessingInk" xmlns:wne="http://schemas.microsoft.com/office/word/2006/wordml" xmlns:wps="http://schemas.microsoft.com/office/word/2010/wordprocessingShape" mc:Ignorable="w14 wp14">
   <w:body>
     <w:p>
+      <w:pPr>
+        <w:pStyle w:val="Title"/>
+      </w:pPr>
       <w:r>
-        <w:rPr>
-          <w:rFonts w:ascii="Inter Tight" w:hAnsi="Inter Tight"/>
-          <w:color w:val="1A1A1A"/>
-          <w:sz w:val="40"/>
-        </w:rPr>
         <w:t>Letter title</w:t>
       </w:r>
     </w:p>
     <w:p>
       <w:r>
-        <w:t>Replace this with your letter body. The header logo, the brand rule, and the footer contact line are part of the letterhead — type your content here. Body text is set in Inter; install the bundled fonts so it renders correctly.</w:t>
+        <w:t>Replace this with your letter body. The header, signal rule, and footer are part of the letterhead. Use the built-in styles so the document keeps the shared rhythm.</w:t>
       </w:r>
     </w:p>
     <w:sectPr>
       <w:headerReference w:type="default" r:id="rId9"/>
       <w:footerReference w:type="default" r:id="rId10"/>
       <w:pgSz w:w="11906" w:h="16838"/>
-      <w:pgMar w:top="1247" w:right="1247" w:bottom="1247" w:left="1247" w:header="720" w:footer="720" w:gutter="0"/>
+      <w:pgMar w:top="1984" w:right="1247" w:bottom="1247" w:left="1247" w:header="720" w:footer="720" w:gutter="0"/>
       <w:cols w:space="720"/>
       <w:docGrid w:linePitch="360"/>
     </w:sectPr>
@@ -88,13 +86,36 @@
       </w:drawing>
     </w:r>
   </w:p>
-  <w:p>
-    <w:pPr>
-      <w:pBdr>
-        <w:bottom w:val="single" w:sz="18" w:space="6" w:color="cf142a"/>
-      </w:pBdr>
-    </w:pPr>
-  </w:p>
+  <w:tbl>
+    <w:tblPr>
+      <w:tblW w:type="auto" w:w="0"/>
+      <w:tblLook w:firstColumn="1" w:firstRow="1" w:lastColumn="0" w:lastRow="0" w:noHBand="0" w:noVBand="1" w:val="04A0"/>
+    </w:tblPr>
+    <w:tblGrid>
+      <w:gridCol w:w="9411"/>
+    </w:tblGrid>
+    <w:tr>
+      <w:tc>
+        <w:tcPr>
+          <w:tcW w:type="dxa" w:w="9411"/>
+          <w:tcBorders>
+            <w:bottom w:val="single" w:sz="12" w:color="cf142a"/>
+          </w:tcBorders>
+        </w:tcPr>
+        <w:p>
+          <w:pPr>
+            <w:spacing w:before="0" w:after="0"/>
+          </w:pPr>
+          <w:r>
+            <w:rPr>
+              <w:sz w:val="2"/>
+            </w:rPr>
+            <w:t xml:space="preserve"> </w:t>
+          </w:r>
+        </w:p>
+      </w:tc>
+    </w:tr>
+  </w:tbl>
 </w:hdr>
 </file>
 
@@ -461,8 +482,12 @@
     <w:name w:val="Normal"/>
     <w:qFormat/>
     <w:rsid w:val="00FC693F"/>
+    <w:pPr>
+      <w:spacing w:after="160" w:line="324" w:lineRule="auto"/>
+    </w:pPr>
     <w:rPr>
       <w:rFonts w:ascii="Inter" w:hAnsi="Inter"/>
+      <w:color w:val="1A1A1A"/>
       <w:sz w:val="22"/>
     </w:rPr>
   </w:style>
@@ -521,15 +546,15 @@
     <w:pPr>
       <w:keepNext/>
       <w:keepLines/>
-      <w:spacing w:before="480" w:after="0"/>
+      <w:spacing w:before="240" w:after="180"/>
       <w:outlineLvl w:val="0"/>
     </w:pPr>
     <w:rPr>
-      <w:rFonts w:asciiTheme="majorHAnsi" w:eastAsiaTheme="majorEastAsia" w:hAnsiTheme="majorHAnsi" w:cstheme="majorBidi"/>
+      <w:rFonts w:asciiTheme="majorHAnsi" w:eastAsiaTheme="majorEastAsia" w:hAnsiTheme="majorHAnsi" w:cstheme="majorBidi" w:ascii="Inter Tight" w:hAnsi="Inter Tight"/>
       <w:b/>
       <w:bCs/>
-      <w:color w:val="365F91" w:themeColor="accent1" w:themeShade="BF"/>
-      <w:sz w:val="28"/>
+      <w:color w:val="1A1A1A"/>
+      <w:sz w:val="40"/>
       <w:szCs w:val="28"/>
     </w:rPr>
   </w:style>
@@ -545,15 +570,15 @@
     <w:pPr>
       <w:keepNext/>
       <w:keepLines/>
-      <w:spacing w:before="200" w:after="0"/>
+      <w:spacing w:before="240" w:after="140"/>
       <w:outlineLvl w:val="1"/>
     </w:pPr>
     <w:rPr>
-      <w:rFonts w:asciiTheme="majorHAnsi" w:eastAsiaTheme="majorEastAsia" w:hAnsiTheme="majorHAnsi" w:cstheme="majorBidi"/>
+      <w:rFonts w:asciiTheme="majorHAnsi" w:eastAsiaTheme="majorEastAsia" w:hAnsiTheme="majorHAnsi" w:cstheme="majorBidi" w:ascii="Inter Tight" w:hAnsi="Inter Tight"/>
       <w:b/>
       <w:bCs/>
-      <w:color w:val="4F81BD" w:themeColor="accent1"/>
-      <w:sz w:val="26"/>
+      <w:color w:val="1A1A1A"/>
+      <w:sz w:val="30"/>
       <w:szCs w:val="26"/>
     </w:rPr>
   </w:style>
@@ -569,14 +594,15 @@
     <w:pPr>
       <w:keepNext/>
       <w:keepLines/>
-      <w:spacing w:before="200" w:after="0"/>
+      <w:spacing w:before="240" w:after="100"/>
       <w:outlineLvl w:val="2"/>
     </w:pPr>
     <w:rPr>
-      <w:rFonts w:asciiTheme="majorHAnsi" w:eastAsiaTheme="majorEastAsia" w:hAnsiTheme="majorHAnsi" w:cstheme="majorBidi"/>
+      <w:rFonts w:asciiTheme="majorHAnsi" w:eastAsiaTheme="majorEastAsia" w:hAnsiTheme="majorHAnsi" w:cstheme="majorBidi" w:ascii="Inter Tight" w:hAnsi="Inter Tight"/>
       <w:b/>
       <w:bCs/>
-      <w:color w:val="4F81BD" w:themeColor="accent1"/>
+      <w:color w:val="CF142A"/>
+      <w:sz w:val="24"/>
     </w:rPr>
   </w:style>
   <w:style w:type="paragraph" w:styleId="Heading4">
@@ -807,18 +833,17 @@
     <w:qFormat/>
     <w:rsid w:val="00FC693F"/>
     <w:pPr>
-      <w:pBdr>
-        <w:bottom w:val="single" w:sz="8" w:space="4" w:color="4F81BD" w:themeColor="accent1"/>
-      </w:pBdr>
-      <w:spacing w:after="300" w:line="240" w:lineRule="auto"/>
+      <w:keepNext/>
+      <w:spacing w:after="240" w:line="240" w:lineRule="auto" w:before="0"/>
       <w:contextualSpacing/>
     </w:pPr>
     <w:rPr>
-      <w:rFonts w:asciiTheme="majorHAnsi" w:eastAsiaTheme="majorEastAsia" w:hAnsiTheme="majorHAnsi" w:cstheme="majorBidi"/>
-      <w:color w:val="17365D" w:themeColor="text2" w:themeShade="BF"/>
+      <w:rFonts w:asciiTheme="majorHAnsi" w:eastAsiaTheme="majorEastAsia" w:hAnsiTheme="majorHAnsi" w:cstheme="majorBidi" w:ascii="Inter Tight" w:hAnsi="Inter Tight"/>
+      <w:b/>
+      <w:color w:val="1A1A1A"/>
       <w:spacing w:val="5"/>
       <w:kern w:val="28"/>
-      <w:sz w:val="52"/>
+      <w:sz w:val="56"/>
       <w:szCs w:val="52"/>
     </w:rPr>
   </w:style>
@@ -12147,6 +12172,18 @@
         <w:shd w:val="clear" w:color="auto" w:fill="FBCAA2" w:themeFill="accent6" w:themeFillTint="7F"/>
       </w:tcPr>
     </w:tblStylePr>
+  </w:style>
+  <w:style w:type="paragraph" w:customStyle="1" w:styleId="AğustosLabel">
+    <w:name w:val="Ağustos Label"/>
+    <w:pPr>
+      <w:spacing w:after="100"/>
+    </w:pPr>
+    <w:rPr>
+      <w:rFonts w:ascii="Inter Tight" w:hAnsi="Inter Tight"/>
+      <w:b/>
+      <w:color w:val="CF142A"/>
+      <w:sz w:val="17"/>
+    </w:rPr>
   </w:style>
 </w:styles>
 </file>

</xml_diff>

<commit_message>
feat: establish design system v3 (#9)
</commit_message>
<xml_diff>
--- a/brand/exports/agustos/office/agustos-letterhead.docx
+++ b/brand/exports/agustos/office/agustos-letterhead.docx
@@ -3,25 +3,23 @@
 <w:document xmlns:wpc="http://schemas.microsoft.com/office/word/2010/wordprocessingCanvas" xmlns:mo="http://schemas.microsoft.com/office/mac/office/2008/main" xmlns:mc="http://schemas.openxmlformats.org/markup-compatibility/2006" xmlns:mv="urn:schemas-microsoft-com:mac:vml" xmlns:o="urn:schemas-microsoft-com:office:office" xmlns:r="http://schemas.openxmlformats.org/officeDocument/2006/relationships" xmlns:m="http://schemas.openxmlformats.org/officeDocument/2006/math" xmlns:v="urn:schemas-microsoft-com:vml" xmlns:wp14="http://schemas.microsoft.com/office/word/2010/wordprocessingDrawing" xmlns:wp="http://schemas.openxmlformats.org/drawingml/2006/wordprocessingDrawing" xmlns:w10="urn:schemas-microsoft-com:office:word" xmlns:w="http://schemas.openxmlformats.org/wordprocessingml/2006/main" xmlns:w14="http://schemas.microsoft.com/office/word/2010/wordml" xmlns:wpg="http://schemas.microsoft.com/office/word/2010/wordprocessingGroup" xmlns:wpi="http://schemas.microsoft.com/office/word/2010/wordprocessingInk" xmlns:wne="http://schemas.microsoft.com/office/word/2006/wordml" xmlns:wps="http://schemas.microsoft.com/office/word/2010/wordprocessingShape" mc:Ignorable="w14 wp14">
   <w:body>
     <w:p>
+      <w:pPr>
+        <w:pStyle w:val="Title"/>
+      </w:pPr>
       <w:r>
-        <w:rPr>
-          <w:rFonts w:ascii="Inter Tight" w:hAnsi="Inter Tight"/>
-          <w:color w:val="1A1A1A"/>
-          <w:sz w:val="40"/>
-        </w:rPr>
         <w:t>Letter title</w:t>
       </w:r>
     </w:p>
     <w:p>
       <w:r>
-        <w:t>Replace this with your letter body. The header logo, the brand rule, and the footer contact line are part of the letterhead — type your content here. Body text is set in Inter; install the bundled fonts so it renders correctly.</w:t>
+        <w:t>Replace this with your letter body. The header, signal rule, and footer are part of the letterhead. Use the built-in styles so the document keeps the shared rhythm.</w:t>
       </w:r>
     </w:p>
     <w:sectPr>
       <w:headerReference w:type="default" r:id="rId9"/>
       <w:footerReference w:type="default" r:id="rId10"/>
       <w:pgSz w:w="11906" w:h="16838"/>
-      <w:pgMar w:top="1247" w:right="1247" w:bottom="1247" w:left="1247" w:header="720" w:footer="720" w:gutter="0"/>
+      <w:pgMar w:top="1984" w:right="1247" w:bottom="1247" w:left="1247" w:header="720" w:footer="720" w:gutter="0"/>
       <w:cols w:space="720"/>
       <w:docGrid w:linePitch="360"/>
     </w:sectPr>
@@ -88,13 +86,36 @@
       </w:drawing>
     </w:r>
   </w:p>
-  <w:p>
-    <w:pPr>
-      <w:pBdr>
-        <w:bottom w:val="single" w:sz="18" w:space="6" w:color="cf142a"/>
-      </w:pBdr>
-    </w:pPr>
-  </w:p>
+  <w:tbl>
+    <w:tblPr>
+      <w:tblW w:type="auto" w:w="0"/>
+      <w:tblLook w:firstColumn="1" w:firstRow="1" w:lastColumn="0" w:lastRow="0" w:noHBand="0" w:noVBand="1" w:val="04A0"/>
+    </w:tblPr>
+    <w:tblGrid>
+      <w:gridCol w:w="9411"/>
+    </w:tblGrid>
+    <w:tr>
+      <w:tc>
+        <w:tcPr>
+          <w:tcW w:type="dxa" w:w="9411"/>
+          <w:tcBorders>
+            <w:bottom w:val="single" w:sz="12" w:color="cf142a"/>
+          </w:tcBorders>
+        </w:tcPr>
+        <w:p>
+          <w:pPr>
+            <w:spacing w:before="0" w:after="0"/>
+          </w:pPr>
+          <w:r>
+            <w:rPr>
+              <w:sz w:val="2"/>
+            </w:rPr>
+            <w:t xml:space="preserve"> </w:t>
+          </w:r>
+        </w:p>
+      </w:tc>
+    </w:tr>
+  </w:tbl>
 </w:hdr>
 </file>
 
@@ -461,8 +482,12 @@
     <w:name w:val="Normal"/>
     <w:qFormat/>
     <w:rsid w:val="00FC693F"/>
+    <w:pPr>
+      <w:spacing w:after="160" w:line="324" w:lineRule="auto"/>
+    </w:pPr>
     <w:rPr>
       <w:rFonts w:ascii="Inter" w:hAnsi="Inter"/>
+      <w:color w:val="1A1A1A"/>
       <w:sz w:val="22"/>
     </w:rPr>
   </w:style>
@@ -521,15 +546,15 @@
     <w:pPr>
       <w:keepNext/>
       <w:keepLines/>
-      <w:spacing w:before="480" w:after="0"/>
+      <w:spacing w:before="240" w:after="180"/>
       <w:outlineLvl w:val="0"/>
     </w:pPr>
     <w:rPr>
-      <w:rFonts w:asciiTheme="majorHAnsi" w:eastAsiaTheme="majorEastAsia" w:hAnsiTheme="majorHAnsi" w:cstheme="majorBidi"/>
+      <w:rFonts w:asciiTheme="majorHAnsi" w:eastAsiaTheme="majorEastAsia" w:hAnsiTheme="majorHAnsi" w:cstheme="majorBidi" w:ascii="Inter Tight" w:hAnsi="Inter Tight"/>
       <w:b/>
       <w:bCs/>
-      <w:color w:val="365F91" w:themeColor="accent1" w:themeShade="BF"/>
-      <w:sz w:val="28"/>
+      <w:color w:val="1A1A1A"/>
+      <w:sz w:val="40"/>
       <w:szCs w:val="28"/>
     </w:rPr>
   </w:style>
@@ -545,15 +570,15 @@
     <w:pPr>
       <w:keepNext/>
       <w:keepLines/>
-      <w:spacing w:before="200" w:after="0"/>
+      <w:spacing w:before="240" w:after="140"/>
       <w:outlineLvl w:val="1"/>
     </w:pPr>
     <w:rPr>
-      <w:rFonts w:asciiTheme="majorHAnsi" w:eastAsiaTheme="majorEastAsia" w:hAnsiTheme="majorHAnsi" w:cstheme="majorBidi"/>
+      <w:rFonts w:asciiTheme="majorHAnsi" w:eastAsiaTheme="majorEastAsia" w:hAnsiTheme="majorHAnsi" w:cstheme="majorBidi" w:ascii="Inter Tight" w:hAnsi="Inter Tight"/>
       <w:b/>
       <w:bCs/>
-      <w:color w:val="4F81BD" w:themeColor="accent1"/>
-      <w:sz w:val="26"/>
+      <w:color w:val="1A1A1A"/>
+      <w:sz w:val="30"/>
       <w:szCs w:val="26"/>
     </w:rPr>
   </w:style>
@@ -569,14 +594,15 @@
     <w:pPr>
       <w:keepNext/>
       <w:keepLines/>
-      <w:spacing w:before="200" w:after="0"/>
+      <w:spacing w:before="240" w:after="100"/>
       <w:outlineLvl w:val="2"/>
     </w:pPr>
     <w:rPr>
-      <w:rFonts w:asciiTheme="majorHAnsi" w:eastAsiaTheme="majorEastAsia" w:hAnsiTheme="majorHAnsi" w:cstheme="majorBidi"/>
+      <w:rFonts w:asciiTheme="majorHAnsi" w:eastAsiaTheme="majorEastAsia" w:hAnsiTheme="majorHAnsi" w:cstheme="majorBidi" w:ascii="Inter Tight" w:hAnsi="Inter Tight"/>
       <w:b/>
       <w:bCs/>
-      <w:color w:val="4F81BD" w:themeColor="accent1"/>
+      <w:color w:val="CF142A"/>
+      <w:sz w:val="24"/>
     </w:rPr>
   </w:style>
   <w:style w:type="paragraph" w:styleId="Heading4">
@@ -807,18 +833,17 @@
     <w:qFormat/>
     <w:rsid w:val="00FC693F"/>
     <w:pPr>
-      <w:pBdr>
-        <w:bottom w:val="single" w:sz="8" w:space="4" w:color="4F81BD" w:themeColor="accent1"/>
-      </w:pBdr>
-      <w:spacing w:after="300" w:line="240" w:lineRule="auto"/>
+      <w:keepNext/>
+      <w:spacing w:after="240" w:line="240" w:lineRule="auto" w:before="0"/>
       <w:contextualSpacing/>
     </w:pPr>
     <w:rPr>
-      <w:rFonts w:asciiTheme="majorHAnsi" w:eastAsiaTheme="majorEastAsia" w:hAnsiTheme="majorHAnsi" w:cstheme="majorBidi"/>
-      <w:color w:val="17365D" w:themeColor="text2" w:themeShade="BF"/>
+      <w:rFonts w:asciiTheme="majorHAnsi" w:eastAsiaTheme="majorEastAsia" w:hAnsiTheme="majorHAnsi" w:cstheme="majorBidi" w:ascii="Inter Tight" w:hAnsi="Inter Tight"/>
+      <w:b/>
+      <w:color w:val="1A1A1A"/>
       <w:spacing w:val="5"/>
       <w:kern w:val="28"/>
-      <w:sz w:val="52"/>
+      <w:sz w:val="56"/>
       <w:szCs w:val="52"/>
     </w:rPr>
   </w:style>
@@ -12147,6 +12172,18 @@
         <w:shd w:val="clear" w:color="auto" w:fill="FBCAA2" w:themeFill="accent6" w:themeFillTint="7F"/>
       </w:tcPr>
     </w:tblStylePr>
+  </w:style>
+  <w:style w:type="paragraph" w:customStyle="1" w:styleId="AğustosLabel">
+    <w:name w:val="Ağustos Label"/>
+    <w:pPr>
+      <w:spacing w:after="100"/>
+    </w:pPr>
+    <w:rPr>
+      <w:rFonts w:ascii="Inter Tight" w:hAnsi="Inter Tight"/>
+      <w:b/>
+      <w:color w:val="CF142A"/>
+      <w:sz w:val="17"/>
+    </w:rPr>
   </w:style>
 </w:styles>
 </file>

</xml_diff>